<commit_message>
client architecture and SQL commands
</commit_message>
<xml_diff>
--- a/Day-2.docx
+++ b/Day-2.docx
@@ -3,7 +3,22 @@
 <w:document xmlns:wpc="http://schemas.microsoft.com/office/word/2010/wordprocessingCanvas" xmlns:cx="http://schemas.microsoft.com/office/drawing/2014/chartex" xmlns:cx1="http://schemas.microsoft.com/office/drawing/2015/9/8/chartex" xmlns:cx2="http://schemas.microsoft.com/office/drawing/2015/10/21/chartex" xmlns:cx3="http://schemas.microsoft.com/office/drawing/2016/5/9/chartex" xmlns:cx4="http://schemas.microsoft.com/office/drawing/2016/5/10/chartex" xmlns:cx5="http://schemas.microsoft.com/office/drawing/2016/5/11/chartex" xmlns:cx6="http://schemas.microsoft.com/office/drawing/2016/5/12/chartex" xmlns:cx7="http://schemas.microsoft.com/office/drawing/2016/5/13/chartex" xmlns:cx8="http://schemas.microsoft.com/office/drawing/2016/5/14/chartex" xmlns:mc="http://schemas.openxmlformats.org/markup-compatibility/2006" xmlns:aink="http://schemas.microsoft.com/office/drawing/2016/ink" xmlns:am3d="http://schemas.microsoft.com/office/drawing/2017/model3d" xmlns:o="urn:schemas-microsoft-com:office:office" xmlns:oel="http://schemas.microsoft.com/office/2019/extlst" xmlns:r="http://schemas.openxmlformats.org/officeDocument/2006/relationships" xmlns:m="http://schemas.openxmlformats.org/officeDocument/2006/math" xmlns:v="urn:schemas-microsoft-com:vml" xmlns:wp14="http://schemas.microsoft.com/office/word/2010/wordprocessingDrawing" xmlns:wp="http://schemas.openxmlformats.org/drawingml/2006/wordprocessingDrawing" xmlns:w10="urn:schemas-microsoft-com:office:word" xmlns:w="http://schemas.openxmlformats.org/wordprocessingml/2006/main" xmlns:w14="http://schemas.microsoft.com/office/word/2010/wordml" xmlns:w15="http://schemas.microsoft.com/office/word/2012/wordml" xmlns:w16cex="http://schemas.microsoft.com/office/word/2018/wordml/cex" xmlns:w16cid="http://schemas.microsoft.com/office/word/2016/wordml/cid" xmlns:w16="http://schemas.microsoft.com/office/word/2018/wordml" xmlns:w16du="http://schemas.microsoft.com/office/word/2023/wordml/word16du" xmlns:w16sdtdh="http://schemas.microsoft.com/office/word/2020/wordml/sdtdatahash" xmlns:w16sdtfl="http://schemas.microsoft.com/office/word/2024/wordml/sdtformatlock" xmlns:w16se="http://schemas.microsoft.com/office/word/2015/wordml/symex" xmlns:wpg="http://schemas.microsoft.com/office/word/2010/wordprocessingGroup" xmlns:wpi="http://schemas.microsoft.com/office/word/2010/wordprocessingInk" xmlns:wne="http://schemas.microsoft.com/office/word/2006/wordml" xmlns:wps="http://schemas.microsoft.com/office/word/2010/wordprocessingShape" mc:Ignorable="w14 w15 w16se w16cid w16 w16cex w16sdtdh w16sdtfl w16du wp14">
   <w:body>
     <w:p>
-      <w:r>
+      <w:pPr>
+        <w:jc w:val="center"/>
+        <w:rPr>
+          <w:b/>
+          <w:bCs/>
+          <w:sz w:val="32"/>
+          <w:szCs w:val="32"/>
+        </w:rPr>
+      </w:pPr>
+      <w:r>
+        <w:rPr>
+          <w:b/>
+          <w:bCs/>
+          <w:sz w:val="32"/>
+          <w:szCs w:val="32"/>
+        </w:rPr>
         <w:t>Day-2</w:t>
       </w:r>
     </w:p>
@@ -34,8 +49,21 @@
     </w:p>
     <w:p>
       <w:r>
-        <w:t>example: 101,Ravi,50000,hyd</w:t>
-      </w:r>
+        <w:t xml:space="preserve">example: </w:t>
+      </w:r>
+      <w:proofErr w:type="gramStart"/>
+      <w:r>
+        <w:t>101,Ravi</w:t>
+      </w:r>
+      <w:proofErr w:type="gramEnd"/>
+      <w:r>
+        <w:t>,</w:t>
+      </w:r>
+      <w:proofErr w:type="gramStart"/>
+      <w:r>
+        <w:t>50000,hyd</w:t>
+      </w:r>
+      <w:proofErr w:type="gramEnd"/>
     </w:p>
     <w:p/>
     <w:p>
@@ -55,14 +83,34 @@
     </w:p>
     <w:p>
       <w:r>
-        <w:t>example: EmpName,EmpId,EmpSalary,EmpAddress</w:t>
-      </w:r>
+        <w:t xml:space="preserve">example: </w:t>
+      </w:r>
+      <w:proofErr w:type="spellStart"/>
+      <w:proofErr w:type="gramStart"/>
+      <w:r>
+        <w:t>EmpName,EmpId</w:t>
+      </w:r>
+      <w:proofErr w:type="gramEnd"/>
+      <w:r>
+        <w:t>,</w:t>
+      </w:r>
+      <w:proofErr w:type="gramStart"/>
+      <w:r>
+        <w:t>EmpSalary,EmpAddress</w:t>
+      </w:r>
+      <w:proofErr w:type="spellEnd"/>
+      <w:proofErr w:type="gramEnd"/>
     </w:p>
     <w:p/>
     <w:p>
       <w:r>
-        <w:t>What is Record ?</w:t>
-      </w:r>
+        <w:t xml:space="preserve">What is </w:t>
+      </w:r>
+      <w:proofErr w:type="gramStart"/>
+      <w:r>
+        <w:t>Record ?</w:t>
+      </w:r>
+      <w:proofErr w:type="gramEnd"/>
     </w:p>
     <w:p>
       <w:r>
@@ -76,14 +124,35 @@
     </w:p>
     <w:p>
       <w:r>
-        <w:t>example :(111,ravi,60000,vjy)</w:t>
+        <w:t>example :(</w:t>
+      </w:r>
+      <w:proofErr w:type="gramStart"/>
+      <w:r>
+        <w:t>111,ravi</w:t>
+      </w:r>
+      <w:proofErr w:type="gramEnd"/>
+      <w:r>
+        <w:t>,</w:t>
+      </w:r>
+      <w:proofErr w:type="gramStart"/>
+      <w:r>
+        <w:t>60000,vjy</w:t>
+      </w:r>
+      <w:proofErr w:type="gramEnd"/>
+      <w:r>
+        <w:t>)</w:t>
       </w:r>
     </w:p>
     <w:p/>
     <w:p>
       <w:r>
-        <w:t>What is a database ?</w:t>
-      </w:r>
+        <w:t xml:space="preserve">What is a </w:t>
+      </w:r>
+      <w:proofErr w:type="gramStart"/>
+      <w:r>
+        <w:t>database ?</w:t>
+      </w:r>
+      <w:proofErr w:type="gramEnd"/>
     </w:p>
     <w:p>
       <w:r>
@@ -96,8 +165,13 @@
       </w:r>
     </w:p>
     <w:p>
-      <w:r>
-        <w:t>example : an employee database containing all employee records.</w:t>
+      <w:proofErr w:type="gramStart"/>
+      <w:r>
+        <w:t>example :</w:t>
+      </w:r>
+      <w:proofErr w:type="gramEnd"/>
+      <w:r>
+        <w:t xml:space="preserve"> an employee database containing all employee records.</w:t>
       </w:r>
     </w:p>
     <w:p/>
@@ -112,25 +186,56 @@
       </w:r>
     </w:p>
     <w:p>
-      <w:r>
-        <w:t>client : the role of the client in client-server architecture is to send requests to the server. and to get a response from the server.</w:t>
+      <w:proofErr w:type="gramStart"/>
+      <w:r>
+        <w:t>client :</w:t>
+      </w:r>
+      <w:proofErr w:type="gramEnd"/>
+      <w:r>
+        <w:t xml:space="preserve"> the role of the client in client-server architecture is to send requests to the server. and to get a response from the server.</w:t>
       </w:r>
     </w:p>
     <w:p/>
     <w:p>
-      <w:r>
-        <w:t>Server : - server is software the role of the server in client-server arch is to take requests from clients.</w:t>
-      </w:r>
-    </w:p>
-    <w:p>
-      <w:r>
-        <w:t>if the request is a valid request then it will generate some response we can handover that response to the client. If the client request is not a valid request then it will raise the errors.</w:t>
+      <w:proofErr w:type="gramStart"/>
+      <w:r>
+        <w:t>Server :</w:t>
+      </w:r>
+      <w:proofErr w:type="gramEnd"/>
+      <w:r>
+        <w:t xml:space="preserve"> - server is software the role of the server in client-server arch is to take requests from clients.</w:t>
+      </w:r>
+    </w:p>
+    <w:p>
+      <w:r>
+        <w:t xml:space="preserve">if the request is a valid </w:t>
+      </w:r>
+      <w:proofErr w:type="gramStart"/>
+      <w:r>
+        <w:t>request</w:t>
+      </w:r>
+      <w:proofErr w:type="gramEnd"/>
+      <w:r>
+        <w:t xml:space="preserve"> then it will generate some response we can handover that response to the client. If the client request is not a valid </w:t>
+      </w:r>
+      <w:proofErr w:type="gramStart"/>
+      <w:r>
+        <w:t>request</w:t>
+      </w:r>
+      <w:proofErr w:type="gramEnd"/>
+      <w:r>
+        <w:t xml:space="preserve"> then it will raise the errors.</w:t>
       </w:r>
     </w:p>
     <w:p/>
     <w:p>
-      <w:r>
-        <w:t>protocol :- it has a set of rules and regulations. The role of the protocol in client-server arch is to send requests from client to server.</w:t>
+      <w:proofErr w:type="gramStart"/>
+      <w:r>
+        <w:t>protocol :</w:t>
+      </w:r>
+      <w:proofErr w:type="gramEnd"/>
+      <w:r>
+        <w:t>- it has a set of rules and regulations. The role of the protocol in client-server arch is to send requests from client to server.</w:t>
       </w:r>
     </w:p>
     <w:p/>
@@ -159,18 +264,42 @@
     <w:p/>
     <w:p>
       <w:r>
-        <w:t>While we are declaring an identifier we have to follow some rules and regulations.</w:t>
+        <w:t xml:space="preserve">While we are declaring an </w:t>
+      </w:r>
+      <w:proofErr w:type="gramStart"/>
+      <w:r>
+        <w:t>identifier</w:t>
+      </w:r>
+      <w:proofErr w:type="gramEnd"/>
+      <w:r>
+        <w:t xml:space="preserve"> we have to follow some rules and regulations.</w:t>
       </w:r>
     </w:p>
     <w:p/>
     <w:p>
       <w:r>
-        <w:t>1. the only allowed characters to declare identifiers a-z or A-Z or 0-9,_,$</w:t>
-      </w:r>
-    </w:p>
-    <w:p>
-      <w:r>
-        <w:t>2. must begin with a letter or underscore(_).</w:t>
+        <w:t>1. the only allowed characters to declare identifiers a-z or A-Z or 0-</w:t>
+      </w:r>
+      <w:proofErr w:type="gramStart"/>
+      <w:r>
+        <w:t>9,_</w:t>
+      </w:r>
+      <w:proofErr w:type="gramEnd"/>
+      <w:r>
+        <w:t>,$</w:t>
+      </w:r>
+    </w:p>
+    <w:p>
+      <w:r>
+        <w:t xml:space="preserve">2. must begin with a letter or </w:t>
+      </w:r>
+      <w:proofErr w:type="gramStart"/>
+      <w:r>
+        <w:t>underscore(</w:t>
+      </w:r>
+      <w:proofErr w:type="gramEnd"/>
+      <w:r>
+        <w:t>_).</w:t>
       </w:r>
     </w:p>
     <w:p>
@@ -722,7 +851,15 @@
           </w:tcPr>
           <w:p>
             <w:r>
-              <w:t>Creates a new database object such as a table, database, view, index, or schema. Example: CREATE TABLE Students (ID INT, Name VARCHAR(50));</w:t>
+              <w:t xml:space="preserve">Creates a new database object such as a table, database, view, index, or schema. Example: CREATE TABLE Students (ID INT, Name </w:t>
+            </w:r>
+            <w:proofErr w:type="gramStart"/>
+            <w:r>
+              <w:t>VARCHAR(</w:t>
+            </w:r>
+            <w:proofErr w:type="gramEnd"/>
+            <w:r>
+              <w:t>50));</w:t>
             </w:r>
           </w:p>
         </w:tc>
@@ -779,7 +916,15 @@
           </w:tcPr>
           <w:p>
             <w:r>
-              <w:t>Modifies the structure of an existing database object, such as adding, deleting, or modifying columns in a table. Example: ALTER TABLE Students ADD Email VARCHAR(100);</w:t>
+              <w:t xml:space="preserve">Modifies the structure of an existing database object, such as adding, deleting, or modifying columns in a table. Example: ALTER TABLE Students ADD Email </w:t>
+            </w:r>
+            <w:proofErr w:type="gramStart"/>
+            <w:r>
+              <w:t>VARCHAR(</w:t>
+            </w:r>
+            <w:proofErr w:type="gramEnd"/>
+            <w:r>
+              <w:t>100);</w:t>
             </w:r>
           </w:p>
         </w:tc>
@@ -1155,7 +1300,15 @@
     </w:p>
     <w:p>
       <w:r>
-        <w:t>•   DECIMAL (M,D)</w:t>
+        <w:t>•   DECIMAL (</w:t>
+      </w:r>
+      <w:proofErr w:type="gramStart"/>
+      <w:r>
+        <w:t>M,D</w:t>
+      </w:r>
+      <w:proofErr w:type="gramEnd"/>
+      <w:r>
+        <w:t>)</w:t>
       </w:r>
     </w:p>
     <w:p>
@@ -1203,6 +1356,7 @@
       <w:r>
         <w:t xml:space="preserve">  CREATE TABLE </w:t>
       </w:r>
+      <w:proofErr w:type="spellStart"/>
       <w:r>
         <w:rPr>
           <w:b/>
@@ -1210,6 +1364,7 @@
         </w:rPr>
         <w:t>tinyint_example</w:t>
       </w:r>
+      <w:proofErr w:type="spellEnd"/>
       <w:r>
         <w:t xml:space="preserve"> (</w:t>
       </w:r>
@@ -1218,6 +1373,7 @@
       <w:r>
         <w:t>      </w:t>
       </w:r>
+      <w:proofErr w:type="spellStart"/>
       <w:r>
         <w:rPr>
           <w:b/>
@@ -1225,6 +1381,7 @@
         </w:rPr>
         <w:t>age</w:t>
       </w:r>
+      <w:proofErr w:type="spellEnd"/>
       <w:r>
         <w:t xml:space="preserve"> TINYINT</w:t>
       </w:r>
@@ -1238,6 +1395,7 @@
       <w:r>
         <w:t xml:space="preserve">  INSERT INTO </w:t>
       </w:r>
+      <w:proofErr w:type="spellStart"/>
       <w:r>
         <w:rPr>
           <w:b/>
@@ -1245,6 +1403,7 @@
         </w:rPr>
         <w:t>tinyint_example</w:t>
       </w:r>
+      <w:proofErr w:type="spellEnd"/>
       <w:r>
         <w:t xml:space="preserve"> (</w:t>
       </w:r>
@@ -1308,6 +1467,7 @@
       <w:r>
         <w:t xml:space="preserve">  CREATE TABLE </w:t>
       </w:r>
+      <w:proofErr w:type="spellStart"/>
       <w:r>
         <w:rPr>
           <w:b/>
@@ -1315,6 +1475,7 @@
         </w:rPr>
         <w:t>smallint_example</w:t>
       </w:r>
+      <w:proofErr w:type="spellEnd"/>
       <w:r>
         <w:t xml:space="preserve"> (</w:t>
       </w:r>
@@ -1343,6 +1504,7 @@
       <w:r>
         <w:t xml:space="preserve">  INSERT INTO </w:t>
       </w:r>
+      <w:proofErr w:type="spellStart"/>
       <w:r>
         <w:rPr>
           <w:b/>
@@ -1350,6 +1512,7 @@
         </w:rPr>
         <w:t>smallint_example</w:t>
       </w:r>
+      <w:proofErr w:type="spellEnd"/>
       <w:r>
         <w:t xml:space="preserve"> (</w:t>
       </w:r>
@@ -1413,6 +1576,7 @@
       <w:r>
         <w:t xml:space="preserve">  CREATE TABLE </w:t>
       </w:r>
+      <w:proofErr w:type="spellStart"/>
       <w:r>
         <w:rPr>
           <w:b/>
@@ -1420,6 +1584,7 @@
         </w:rPr>
         <w:t>mediumint_example</w:t>
       </w:r>
+      <w:proofErr w:type="spellEnd"/>
       <w:r>
         <w:t xml:space="preserve"> (</w:t>
       </w:r>
@@ -1448,6 +1613,7 @@
       <w:r>
         <w:t xml:space="preserve">  INSERT INTO </w:t>
       </w:r>
+      <w:proofErr w:type="spellStart"/>
       <w:r>
         <w:rPr>
           <w:b/>
@@ -1455,6 +1621,7 @@
         </w:rPr>
         <w:t>mediumint_example</w:t>
       </w:r>
+      <w:proofErr w:type="spellEnd"/>
       <w:r>
         <w:t xml:space="preserve"> (</w:t>
       </w:r>
@@ -1519,6 +1686,7 @@
       <w:r>
         <w:t xml:space="preserve">  CREATE TABLE </w:t>
       </w:r>
+      <w:proofErr w:type="spellStart"/>
       <w:r>
         <w:rPr>
           <w:b/>
@@ -1526,6 +1694,7 @@
         </w:rPr>
         <w:t>int_example</w:t>
       </w:r>
+      <w:proofErr w:type="spellEnd"/>
       <w:r>
         <w:t xml:space="preserve"> (</w:t>
       </w:r>
@@ -1534,6 +1703,7 @@
       <w:r>
         <w:t>      </w:t>
       </w:r>
+      <w:proofErr w:type="spellStart"/>
       <w:r>
         <w:rPr>
           <w:b/>
@@ -1541,6 +1711,7 @@
         </w:rPr>
         <w:t>product_id</w:t>
       </w:r>
+      <w:proofErr w:type="spellEnd"/>
       <w:r>
         <w:t xml:space="preserve"> INT</w:t>
       </w:r>
@@ -1554,6 +1725,7 @@
       <w:r>
         <w:t xml:space="preserve">  INSERT INTO </w:t>
       </w:r>
+      <w:proofErr w:type="spellStart"/>
       <w:r>
         <w:rPr>
           <w:b/>
@@ -1561,9 +1733,11 @@
         </w:rPr>
         <w:t>int_example</w:t>
       </w:r>
+      <w:proofErr w:type="spellEnd"/>
       <w:r>
         <w:t xml:space="preserve"> (</w:t>
       </w:r>
+      <w:proofErr w:type="spellStart"/>
       <w:r>
         <w:rPr>
           <w:b/>
@@ -1571,6 +1745,7 @@
         </w:rPr>
         <w:t>product_id</w:t>
       </w:r>
+      <w:proofErr w:type="spellEnd"/>
       <w:r>
         <w:t>) VALUES (123456);</w:t>
       </w:r>
@@ -1624,6 +1799,7 @@
       <w:r>
         <w:t xml:space="preserve">  CREATE TABLE </w:t>
       </w:r>
+      <w:proofErr w:type="spellStart"/>
       <w:r>
         <w:rPr>
           <w:b/>
@@ -1631,6 +1807,7 @@
         </w:rPr>
         <w:t>bigint_example</w:t>
       </w:r>
+      <w:proofErr w:type="spellEnd"/>
       <w:r>
         <w:t xml:space="preserve"> (</w:t>
       </w:r>
@@ -1639,6 +1816,7 @@
       <w:r>
         <w:t>      </w:t>
       </w:r>
+      <w:proofErr w:type="spellStart"/>
       <w:r>
         <w:rPr>
           <w:b/>
@@ -1646,6 +1824,7 @@
         </w:rPr>
         <w:t>account_balance</w:t>
       </w:r>
+      <w:proofErr w:type="spellEnd"/>
       <w:r>
         <w:t xml:space="preserve"> BIGINT</w:t>
       </w:r>
@@ -1659,6 +1838,7 @@
       <w:r>
         <w:t xml:space="preserve">  INSERT INTO </w:t>
       </w:r>
+      <w:proofErr w:type="spellStart"/>
       <w:r>
         <w:rPr>
           <w:b/>
@@ -1666,9 +1846,11 @@
         </w:rPr>
         <w:t>bigint_example</w:t>
       </w:r>
+      <w:proofErr w:type="spellEnd"/>
       <w:r>
         <w:t xml:space="preserve"> (</w:t>
       </w:r>
+      <w:proofErr w:type="spellStart"/>
       <w:r>
         <w:rPr>
           <w:b/>
@@ -1676,6 +1858,7 @@
         </w:rPr>
         <w:t>account_balance</w:t>
       </w:r>
+      <w:proofErr w:type="spellEnd"/>
       <w:r>
         <w:t>) VALUES (5000000000);</w:t>
       </w:r>
@@ -1724,6 +1907,7 @@
       <w:r>
         <w:t xml:space="preserve">  CREATE TABLE </w:t>
       </w:r>
+      <w:proofErr w:type="spellStart"/>
       <w:r>
         <w:rPr>
           <w:b/>
@@ -1731,6 +1915,7 @@
         </w:rPr>
         <w:t>float_example</w:t>
       </w:r>
+      <w:proofErr w:type="spellEnd"/>
       <w:r>
         <w:t xml:space="preserve"> (</w:t>
       </w:r>
@@ -1759,6 +1944,7 @@
       <w:r>
         <w:t xml:space="preserve">  INSERT INTO </w:t>
       </w:r>
+      <w:proofErr w:type="spellStart"/>
       <w:r>
         <w:rPr>
           <w:b/>
@@ -1766,6 +1952,7 @@
         </w:rPr>
         <w:t>float_example</w:t>
       </w:r>
+      <w:proofErr w:type="spellEnd"/>
       <w:r>
         <w:t xml:space="preserve"> (</w:t>
       </w:r>
@@ -1825,6 +2012,7 @@
         <w:lastRenderedPageBreak/>
         <w:t xml:space="preserve">  CREATE TABLE </w:t>
       </w:r>
+      <w:proofErr w:type="spellStart"/>
       <w:r>
         <w:rPr>
           <w:b/>
@@ -1832,6 +2020,7 @@
         </w:rPr>
         <w:t>double_example</w:t>
       </w:r>
+      <w:proofErr w:type="spellEnd"/>
       <w:r>
         <w:t xml:space="preserve"> (</w:t>
       </w:r>
@@ -1860,6 +2049,7 @@
       <w:r>
         <w:t xml:space="preserve">  INSERT INTO </w:t>
       </w:r>
+      <w:proofErr w:type="spellStart"/>
       <w:r>
         <w:rPr>
           <w:b/>
@@ -1867,6 +2057,7 @@
         </w:rPr>
         <w:t>double_example</w:t>
       </w:r>
+      <w:proofErr w:type="spellEnd"/>
       <w:r>
         <w:t xml:space="preserve"> (</w:t>
       </w:r>
@@ -1898,7 +2089,23 @@
           <w:b/>
           <w:bCs/>
         </w:rPr>
-        <w:t>DECIMAL (M,D)</w:t>
+        <w:t>DECIMAL (</w:t>
+      </w:r>
+      <w:proofErr w:type="gramStart"/>
+      <w:r>
+        <w:rPr>
+          <w:b/>
+          <w:bCs/>
+        </w:rPr>
+        <w:t>M,D</w:t>
+      </w:r>
+      <w:proofErr w:type="gramEnd"/>
+      <w:r>
+        <w:rPr>
+          <w:b/>
+          <w:bCs/>
+        </w:rPr>
+        <w:t>)</w:t>
       </w:r>
     </w:p>
     <w:p>
@@ -1920,6 +2127,7 @@
       <w:r>
         <w:t xml:space="preserve">  CREATE TABLE </w:t>
       </w:r>
+      <w:proofErr w:type="spellStart"/>
       <w:r>
         <w:rPr>
           <w:b/>
@@ -1927,6 +2135,7 @@
         </w:rPr>
         <w:t>decimal_example</w:t>
       </w:r>
+      <w:proofErr w:type="spellEnd"/>
       <w:r>
         <w:t xml:space="preserve"> (</w:t>
       </w:r>
@@ -1943,7 +2152,15 @@
         <w:t>price</w:t>
       </w:r>
       <w:r>
-        <w:t xml:space="preserve"> DECIMAL(10, 2)</w:t>
+        <w:t xml:space="preserve"> </w:t>
+      </w:r>
+      <w:proofErr w:type="gramStart"/>
+      <w:r>
+        <w:t>DECIMAL(</w:t>
+      </w:r>
+      <w:proofErr w:type="gramEnd"/>
+      <w:r>
+        <w:t>10, 2)</w:t>
       </w:r>
     </w:p>
     <w:p>
@@ -1955,6 +2172,7 @@
       <w:r>
         <w:t xml:space="preserve">  INSERT INTO </w:t>
       </w:r>
+      <w:proofErr w:type="spellStart"/>
       <w:r>
         <w:rPr>
           <w:b/>
@@ -1962,6 +2180,7 @@
         </w:rPr>
         <w:t>decimal_example</w:t>
       </w:r>
+      <w:proofErr w:type="spellEnd"/>
       <w:r>
         <w:t xml:space="preserve"> (</w:t>
       </w:r>
@@ -2119,7 +2338,15 @@
         <w:t>code</w:t>
       </w:r>
       <w:r>
-        <w:t xml:space="preserve"> CHAR(5)</w:t>
+        <w:t xml:space="preserve"> </w:t>
+      </w:r>
+      <w:proofErr w:type="gramStart"/>
+      <w:r>
+        <w:t>CHAR(</w:t>
+      </w:r>
+      <w:proofErr w:type="gramEnd"/>
+      <w:r>
+        <w:t>5)</w:t>
       </w:r>
     </w:p>
     <w:p>
@@ -2225,7 +2452,15 @@
         <w:t>name</w:t>
       </w:r>
       <w:r>
-        <w:t xml:space="preserve"> VARCHAR(50)</w:t>
+        <w:t xml:space="preserve"> </w:t>
+      </w:r>
+      <w:proofErr w:type="gramStart"/>
+      <w:r>
+        <w:t>VARCHAR(</w:t>
+      </w:r>
+      <w:proofErr w:type="gramEnd"/>
+      <w:r>
+        <w:t>50)</w:t>
       </w:r>
     </w:p>
     <w:p>
@@ -2312,6 +2547,7 @@
       <w:r>
         <w:t xml:space="preserve">  CREATE TABLE </w:t>
       </w:r>
+      <w:proofErr w:type="spellStart"/>
       <w:r>
         <w:rPr>
           <w:b/>
@@ -2319,6 +2555,7 @@
         </w:rPr>
         <w:t>test_binary</w:t>
       </w:r>
+      <w:proofErr w:type="spellEnd"/>
       <w:r>
         <w:t xml:space="preserve"> (</w:t>
       </w:r>
@@ -2327,6 +2564,7 @@
       <w:r>
         <w:t>      </w:t>
       </w:r>
+      <w:proofErr w:type="spellStart"/>
       <w:r>
         <w:rPr>
           <w:b/>
@@ -2334,8 +2572,17 @@
         </w:rPr>
         <w:t>bin_col</w:t>
       </w:r>
-      <w:r>
-        <w:t xml:space="preserve"> BINARY(5)</w:t>
+      <w:proofErr w:type="spellEnd"/>
+      <w:r>
+        <w:t xml:space="preserve"> </w:t>
+      </w:r>
+      <w:proofErr w:type="gramStart"/>
+      <w:r>
+        <w:t>BINARY(</w:t>
+      </w:r>
+      <w:proofErr w:type="gramEnd"/>
+      <w:r>
+        <w:t>5)</w:t>
       </w:r>
     </w:p>
     <w:p>
@@ -2352,6 +2599,7 @@
       <w:r>
         <w:t xml:space="preserve">  INSERT INTO </w:t>
       </w:r>
+      <w:proofErr w:type="spellStart"/>
       <w:r>
         <w:rPr>
           <w:b/>
@@ -2359,9 +2607,11 @@
         </w:rPr>
         <w:t>test_binary</w:t>
       </w:r>
+      <w:proofErr w:type="spellEnd"/>
       <w:r>
         <w:t xml:space="preserve"> (</w:t>
       </w:r>
+      <w:proofErr w:type="spellStart"/>
       <w:r>
         <w:rPr>
           <w:b/>
@@ -2369,13 +2619,30 @@
         </w:rPr>
         <w:t>bin_col</w:t>
       </w:r>
-      <w:r>
-        <w:t>) VALUES ('abc');</w:t>
-      </w:r>
-    </w:p>
-    <w:p>
-      <w:r>
-        <w:t>  -- Stored as: 'abc\0\0'</w:t>
+      <w:proofErr w:type="spellEnd"/>
+      <w:r>
+        <w:t>) VALUES ('</w:t>
+      </w:r>
+      <w:proofErr w:type="spellStart"/>
+      <w:r>
+        <w:t>abc</w:t>
+      </w:r>
+      <w:proofErr w:type="spellEnd"/>
+      <w:r>
+        <w:t>');</w:t>
+      </w:r>
+    </w:p>
+    <w:p>
+      <w:r>
+        <w:t>  -- Stored as: '</w:t>
+      </w:r>
+      <w:proofErr w:type="spellStart"/>
+      <w:r>
+        <w:t>abc</w:t>
+      </w:r>
+      <w:proofErr w:type="spellEnd"/>
+      <w:r>
+        <w:t>\0\0'</w:t>
       </w:r>
     </w:p>
     <w:p>
@@ -2422,6 +2689,7 @@
       <w:r>
         <w:t xml:space="preserve">  CREATE TABLE </w:t>
       </w:r>
+      <w:proofErr w:type="spellStart"/>
       <w:r>
         <w:rPr>
           <w:b/>
@@ -2429,6 +2697,7 @@
         </w:rPr>
         <w:t>test_varbinary</w:t>
       </w:r>
+      <w:proofErr w:type="spellEnd"/>
       <w:r>
         <w:t xml:space="preserve"> (</w:t>
       </w:r>
@@ -2437,6 +2706,7 @@
       <w:r>
         <w:t>      </w:t>
       </w:r>
+      <w:proofErr w:type="spellStart"/>
       <w:r>
         <w:rPr>
           <w:b/>
@@ -2444,8 +2714,17 @@
         </w:rPr>
         <w:t>varbin_col</w:t>
       </w:r>
-      <w:r>
-        <w:t xml:space="preserve"> VARBINARY(5)</w:t>
+      <w:proofErr w:type="spellEnd"/>
+      <w:r>
+        <w:t xml:space="preserve"> </w:t>
+      </w:r>
+      <w:proofErr w:type="gramStart"/>
+      <w:r>
+        <w:t>VARBINARY(</w:t>
+      </w:r>
+      <w:proofErr w:type="gramEnd"/>
+      <w:r>
+        <w:t>5)</w:t>
       </w:r>
     </w:p>
     <w:p>
@@ -2463,6 +2742,7 @@
         <w:lastRenderedPageBreak/>
         <w:t xml:space="preserve">  INSERT INTO </w:t>
       </w:r>
+      <w:proofErr w:type="spellStart"/>
       <w:r>
         <w:rPr>
           <w:b/>
@@ -2470,9 +2750,11 @@
         </w:rPr>
         <w:t>test_varbinary</w:t>
       </w:r>
+      <w:proofErr w:type="spellEnd"/>
       <w:r>
         <w:t xml:space="preserve"> (</w:t>
       </w:r>
+      <w:proofErr w:type="spellStart"/>
       <w:r>
         <w:rPr>
           <w:b/>
@@ -2480,13 +2762,30 @@
         </w:rPr>
         <w:t>varbin_col</w:t>
       </w:r>
-      <w:r>
-        <w:t>) VALUES ('abc');</w:t>
-      </w:r>
-    </w:p>
-    <w:p>
-      <w:r>
-        <w:t>  -- Stored as: 'abc'</w:t>
+      <w:proofErr w:type="spellEnd"/>
+      <w:r>
+        <w:t>) VALUES ('</w:t>
+      </w:r>
+      <w:proofErr w:type="spellStart"/>
+      <w:r>
+        <w:t>abc</w:t>
+      </w:r>
+      <w:proofErr w:type="spellEnd"/>
+      <w:r>
+        <w:t>');</w:t>
+      </w:r>
+    </w:p>
+    <w:p>
+      <w:r>
+        <w:t>  -- Stored as: '</w:t>
+      </w:r>
+      <w:proofErr w:type="spellStart"/>
+      <w:r>
+        <w:t>abc</w:t>
+      </w:r>
+      <w:proofErr w:type="spellEnd"/>
+      <w:r>
+        <w:t>'</w:t>
       </w:r>
     </w:p>
     <w:p>
@@ -3868,6 +4167,7 @@
       <w:r>
         <w:t>      </w:t>
       </w:r>
+      <w:proofErr w:type="spellStart"/>
       <w:r>
         <w:rPr>
           <w:b/>
@@ -3875,6 +4175,7 @@
         </w:rPr>
         <w:t>short_text</w:t>
       </w:r>
+      <w:proofErr w:type="spellEnd"/>
       <w:r>
         <w:t xml:space="preserve"> TINYTEXT,</w:t>
       </w:r>
@@ -3883,6 +4184,7 @@
       <w:r>
         <w:t>      </w:t>
       </w:r>
+      <w:proofErr w:type="spellStart"/>
       <w:r>
         <w:rPr>
           <w:b/>
@@ -3890,6 +4192,7 @@
         </w:rPr>
         <w:t>medium_text</w:t>
       </w:r>
+      <w:proofErr w:type="spellEnd"/>
       <w:r>
         <w:t xml:space="preserve"> MEDIUMTEXT,</w:t>
       </w:r>
@@ -3898,6 +4201,7 @@
       <w:r>
         <w:t>      </w:t>
       </w:r>
+      <w:proofErr w:type="spellStart"/>
       <w:r>
         <w:rPr>
           <w:b/>
@@ -3905,6 +4209,7 @@
         </w:rPr>
         <w:t>long_text</w:t>
       </w:r>
+      <w:proofErr w:type="spellEnd"/>
       <w:r>
         <w:t xml:space="preserve"> LONGTEXT</w:t>
       </w:r>
@@ -3928,6 +4233,7 @@
       <w:r>
         <w:t xml:space="preserve"> (</w:t>
       </w:r>
+      <w:proofErr w:type="spellStart"/>
       <w:r>
         <w:rPr>
           <w:b/>
@@ -3935,9 +4241,11 @@
         </w:rPr>
         <w:t>short_text</w:t>
       </w:r>
+      <w:proofErr w:type="spellEnd"/>
       <w:r>
         <w:t xml:space="preserve">, </w:t>
       </w:r>
+      <w:proofErr w:type="spellStart"/>
       <w:r>
         <w:rPr>
           <w:b/>
@@ -3945,9 +4253,11 @@
         </w:rPr>
         <w:t>medium_text</w:t>
       </w:r>
+      <w:proofErr w:type="spellEnd"/>
       <w:r>
         <w:t xml:space="preserve">, </w:t>
       </w:r>
+      <w:proofErr w:type="spellStart"/>
       <w:r>
         <w:rPr>
           <w:b/>
@@ -3955,6 +4265,7 @@
         </w:rPr>
         <w:t>long_text</w:t>
       </w:r>
+      <w:proofErr w:type="spellEnd"/>
       <w:r>
         <w:t>)</w:t>
       </w:r>
@@ -4031,7 +4342,15 @@
         <w:t>status</w:t>
       </w:r>
       <w:r>
-        <w:t xml:space="preserve"> ENUM('active', 'inactive', 'pending')</w:t>
+        <w:t xml:space="preserve"> </w:t>
+      </w:r>
+      <w:proofErr w:type="gramStart"/>
+      <w:r>
+        <w:t>ENUM(</w:t>
+      </w:r>
+      <w:proofErr w:type="gramEnd"/>
+      <w:r>
+        <w:t>'active', 'inactive', 'pending')</w:t>
       </w:r>
     </w:p>
     <w:p>
@@ -4132,7 +4451,15 @@
         <w:t>permissions</w:t>
       </w:r>
       <w:r>
-        <w:t xml:space="preserve"> SET('read', 'write', 'execute')</w:t>
+        <w:t xml:space="preserve"> </w:t>
+      </w:r>
+      <w:proofErr w:type="gramStart"/>
+      <w:r>
+        <w:t>SET(</w:t>
+      </w:r>
+      <w:proofErr w:type="gramEnd"/>
+      <w:r>
+        <w:t>'read', 'write', 'execute')</w:t>
       </w:r>
     </w:p>
     <w:p>
@@ -4162,7 +4489,27 @@
         <w:t>permissions</w:t>
       </w:r>
       <w:r>
-        <w:t>) VALUES ('read,write'), ('write,execute');</w:t>
+        <w:t>) VALUES ('</w:t>
+      </w:r>
+      <w:proofErr w:type="spellStart"/>
+      <w:proofErr w:type="gramStart"/>
+      <w:r>
+        <w:t>read,write</w:t>
+      </w:r>
+      <w:proofErr w:type="spellEnd"/>
+      <w:proofErr w:type="gramEnd"/>
+      <w:r>
+        <w:t>'), ('</w:t>
+      </w:r>
+      <w:proofErr w:type="spellStart"/>
+      <w:proofErr w:type="gramStart"/>
+      <w:r>
+        <w:t>write,execute</w:t>
+      </w:r>
+      <w:proofErr w:type="spellEnd"/>
+      <w:proofErr w:type="gramEnd"/>
+      <w:r>
+        <w:t>');</w:t>
       </w:r>
     </w:p>
     <w:p>
@@ -4243,7 +4590,15 @@
     </w:p>
     <w:p>
       <w:r>
-        <w:t>•   In this example, the OrderDate column uses the DATE data type to store the date of the order.</w:t>
+        <w:t xml:space="preserve">•   In this example, the </w:t>
+      </w:r>
+      <w:proofErr w:type="spellStart"/>
+      <w:r>
+        <w:t>OrderDate</w:t>
+      </w:r>
+      <w:proofErr w:type="spellEnd"/>
+      <w:r>
+        <w:t xml:space="preserve"> column uses the DATE data type to store the date of the order.</w:t>
       </w:r>
     </w:p>
     <w:p>
@@ -4270,6 +4625,7 @@
       <w:r>
         <w:t>      </w:t>
       </w:r>
+      <w:proofErr w:type="spellStart"/>
       <w:r>
         <w:rPr>
           <w:b/>
@@ -4277,6 +4633,7 @@
         </w:rPr>
         <w:t>OrderId</w:t>
       </w:r>
+      <w:proofErr w:type="spellEnd"/>
       <w:r>
         <w:t xml:space="preserve"> int,</w:t>
       </w:r>
@@ -4293,13 +4650,22 @@
         <w:t>ProductName</w:t>
       </w:r>
       <w:r>
-        <w:t xml:space="preserve"> varchar(255),</w:t>
+        <w:t xml:space="preserve"> </w:t>
+      </w:r>
+      <w:proofErr w:type="gramStart"/>
+      <w:r>
+        <w:t>varchar(</w:t>
+      </w:r>
+      <w:proofErr w:type="gramEnd"/>
+      <w:r>
+        <w:t>255),</w:t>
       </w:r>
     </w:p>
     <w:p>
       <w:r>
         <w:t>      </w:t>
       </w:r>
+      <w:proofErr w:type="spellStart"/>
       <w:r>
         <w:rPr>
           <w:b/>
@@ -4307,6 +4673,7 @@
         </w:rPr>
         <w:t>OrderDate</w:t>
       </w:r>
+      <w:proofErr w:type="spellEnd"/>
       <w:r>
         <w:t xml:space="preserve"> date</w:t>
       </w:r>
@@ -4360,6 +4727,7 @@
       <w:r>
         <w:t xml:space="preserve"> (</w:t>
       </w:r>
+      <w:proofErr w:type="spellStart"/>
       <w:r>
         <w:rPr>
           <w:b/>
@@ -4367,6 +4735,7 @@
         </w:rPr>
         <w:t>OrderId</w:t>
       </w:r>
+      <w:proofErr w:type="spellEnd"/>
       <w:r>
         <w:t xml:space="preserve">, </w:t>
       </w:r>
@@ -4380,6 +4749,7 @@
       <w:r>
         <w:t xml:space="preserve">, </w:t>
       </w:r>
+      <w:proofErr w:type="spellStart"/>
       <w:r>
         <w:rPr>
           <w:b/>
@@ -4387,6 +4757,7 @@
         </w:rPr>
         <w:t>OrderDate</w:t>
       </w:r>
+      <w:proofErr w:type="spellEnd"/>
       <w:r>
         <w:t>)</w:t>
       </w:r>
@@ -4443,6 +4814,7 @@
       <w:r>
         <w:t xml:space="preserve">  WHERE </w:t>
       </w:r>
+      <w:proofErr w:type="spellStart"/>
       <w:r>
         <w:rPr>
           <w:b/>
@@ -4450,6 +4822,7 @@
         </w:rPr>
         <w:t>OrderDate</w:t>
       </w:r>
+      <w:proofErr w:type="spellEnd"/>
       <w:r>
         <w:t xml:space="preserve"> = '2022-01-01';</w:t>
       </w:r>
@@ -4476,7 +4849,15 @@
     </w:p>
     <w:p>
       <w:r>
-        <w:t>•   In SQL, the DateTime data type is used to work with dates and times.</w:t>
+        <w:t xml:space="preserve">•   In SQL, the </w:t>
+      </w:r>
+      <w:proofErr w:type="spellStart"/>
+      <w:r>
+        <w:t>DateTime</w:t>
+      </w:r>
+      <w:proofErr w:type="spellEnd"/>
+      <w:r>
+        <w:t xml:space="preserve"> data type is used to work with dates and times.</w:t>
       </w:r>
     </w:p>
     <w:p>
@@ -4491,22 +4872,54 @@
     </w:p>
     <w:p>
       <w:r>
-        <w:t>◦    CURDATE()</w:t>
-      </w:r>
-    </w:p>
-    <w:p>
-      <w:r>
-        <w:t>◦    DATE_ADD()</w:t>
-      </w:r>
-    </w:p>
-    <w:p>
-      <w:r>
-        <w:t>◦    DATE_SUB()</w:t>
-      </w:r>
-    </w:p>
-    <w:p>
-      <w:r>
-        <w:t>◦    DATEDIFF()</w:t>
+        <w:t xml:space="preserve">◦    </w:t>
+      </w:r>
+      <w:proofErr w:type="gramStart"/>
+      <w:r>
+        <w:t>CURDATE(</w:t>
+      </w:r>
+      <w:proofErr w:type="gramEnd"/>
+      <w:r>
+        <w:t>)</w:t>
+      </w:r>
+    </w:p>
+    <w:p>
+      <w:r>
+        <w:t>◦    DATE_</w:t>
+      </w:r>
+      <w:proofErr w:type="gramStart"/>
+      <w:r>
+        <w:t>ADD(</w:t>
+      </w:r>
+      <w:proofErr w:type="gramEnd"/>
+      <w:r>
+        <w:t>)</w:t>
+      </w:r>
+    </w:p>
+    <w:p>
+      <w:r>
+        <w:t>◦    DATE_</w:t>
+      </w:r>
+      <w:proofErr w:type="gramStart"/>
+      <w:r>
+        <w:t>SUB(</w:t>
+      </w:r>
+      <w:proofErr w:type="gramEnd"/>
+      <w:r>
+        <w:t>)</w:t>
+      </w:r>
+    </w:p>
+    <w:p>
+      <w:r>
+        <w:t xml:space="preserve">◦    </w:t>
+      </w:r>
+      <w:proofErr w:type="gramStart"/>
+      <w:r>
+        <w:t>DATEDIFF(</w:t>
+      </w:r>
+      <w:proofErr w:type="gramEnd"/>
+      <w:r>
+        <w:t>)</w:t>
       </w:r>
     </w:p>
     <w:p>
@@ -4521,7 +4934,23 @@
           <w:b/>
           <w:bCs/>
         </w:rPr>
-        <w:t>CURRENT_DATE()</w:t>
+        <w:t>CURRENT_</w:t>
+      </w:r>
+      <w:proofErr w:type="gramStart"/>
+      <w:r>
+        <w:rPr>
+          <w:b/>
+          <w:bCs/>
+        </w:rPr>
+        <w:t>DATE(</w:t>
+      </w:r>
+      <w:proofErr w:type="gramEnd"/>
+      <w:r>
+        <w:rPr>
+          <w:b/>
+          <w:bCs/>
+        </w:rPr>
+        <w:t>)</w:t>
       </w:r>
     </w:p>
     <w:p>
@@ -4538,6 +4967,7 @@
       <w:r>
         <w:t xml:space="preserve">  SELECT </w:t>
       </w:r>
+      <w:proofErr w:type="gramStart"/>
       <w:r>
         <w:rPr>
           <w:b/>
@@ -4546,7 +4976,11 @@
         <w:t>CURDATE</w:t>
       </w:r>
       <w:r>
-        <w:t>();</w:t>
+        <w:t>(</w:t>
+      </w:r>
+      <w:proofErr w:type="gramEnd"/>
+      <w:r>
+        <w:t>);</w:t>
       </w:r>
     </w:p>
     <w:p>
@@ -4561,12 +4995,37 @@
           <w:bCs/>
         </w:rPr>
       </w:pPr>
-      <w:r>
-        <w:rPr>
-          <w:b/>
-          <w:bCs/>
-        </w:rPr>
-        <w:t>DATEADD() &amp; DATESUB()</w:t>
+      <w:proofErr w:type="gramStart"/>
+      <w:r>
+        <w:rPr>
+          <w:b/>
+          <w:bCs/>
+        </w:rPr>
+        <w:t>DATEADD(</w:t>
+      </w:r>
+      <w:proofErr w:type="gramEnd"/>
+      <w:r>
+        <w:rPr>
+          <w:b/>
+          <w:bCs/>
+        </w:rPr>
+        <w:t xml:space="preserve">) &amp; </w:t>
+      </w:r>
+      <w:proofErr w:type="gramStart"/>
+      <w:r>
+        <w:rPr>
+          <w:b/>
+          <w:bCs/>
+        </w:rPr>
+        <w:t>DATESUB(</w:t>
+      </w:r>
+      <w:proofErr w:type="gramEnd"/>
+      <w:r>
+        <w:rPr>
+          <w:b/>
+          <w:bCs/>
+        </w:rPr>
+        <w:t>)</w:t>
       </w:r>
     </w:p>
     <w:p>
@@ -4588,10 +5047,22 @@
           <w:b/>
           <w:bCs/>
         </w:rPr>
-        <w:t>DATE_ADD</w:t>
-      </w:r>
-      <w:r>
-        <w:t>('2024-01-09', INTERVAL 3 MONTHS)</w:t>
+        <w:t>DATE_</w:t>
+      </w:r>
+      <w:proofErr w:type="gramStart"/>
+      <w:r>
+        <w:rPr>
+          <w:b/>
+          <w:bCs/>
+        </w:rPr>
+        <w:t>ADD</w:t>
+      </w:r>
+      <w:r>
+        <w:t>(</w:t>
+      </w:r>
+      <w:proofErr w:type="gramEnd"/>
+      <w:r>
+        <w:t>'2024-01-09', INTERVAL 3 MONTHS)</w:t>
       </w:r>
     </w:p>
     <w:p>
@@ -4603,10 +5074,22 @@
           <w:b/>
           <w:bCs/>
         </w:rPr>
-        <w:t>DATE_SUB</w:t>
-      </w:r>
-      <w:r>
-        <w:t>('2024-01-09', INTERVAL 3 MONTHS)</w:t>
+        <w:t>DATE_</w:t>
+      </w:r>
+      <w:proofErr w:type="gramStart"/>
+      <w:r>
+        <w:rPr>
+          <w:b/>
+          <w:bCs/>
+        </w:rPr>
+        <w:t>SUB</w:t>
+      </w:r>
+      <w:r>
+        <w:t>(</w:t>
+      </w:r>
+      <w:proofErr w:type="gramEnd"/>
+      <w:r>
+        <w:t>'2024-01-09', INTERVAL 3 MONTHS)</w:t>
       </w:r>
     </w:p>
     <w:p>
@@ -4621,12 +5104,21 @@
           <w:bCs/>
         </w:rPr>
       </w:pPr>
-      <w:r>
-        <w:rPr>
-          <w:b/>
-          <w:bCs/>
-        </w:rPr>
-        <w:t>DATEDIFF()</w:t>
+      <w:proofErr w:type="gramStart"/>
+      <w:r>
+        <w:rPr>
+          <w:b/>
+          <w:bCs/>
+        </w:rPr>
+        <w:t>DATEDIFF(</w:t>
+      </w:r>
+      <w:proofErr w:type="gramEnd"/>
+      <w:r>
+        <w:rPr>
+          <w:b/>
+          <w:bCs/>
+        </w:rPr>
+        <w:t>)</w:t>
       </w:r>
     </w:p>
     <w:p>
@@ -4643,6 +5135,7 @@
       <w:r>
         <w:t xml:space="preserve">  SELECT </w:t>
       </w:r>
+      <w:proofErr w:type="gramStart"/>
       <w:r>
         <w:rPr>
           <w:b/>
@@ -4651,7 +5144,11 @@
         <w:t>DATEDIFF</w:t>
       </w:r>
       <w:r>
-        <w:t>('2024-01-09', '2024-01-14')</w:t>
+        <w:t>(</w:t>
+      </w:r>
+      <w:proofErr w:type="gramEnd"/>
+      <w:r>
+        <w:t>'2024-01-09', '2024-01-14')</w:t>
       </w:r>
     </w:p>
     <w:p>
@@ -4686,7 +5183,15 @@
     </w:p>
     <w:p>
       <w:r>
-        <w:t>•   The format of a TIME is 'HH:MI:SS'.</w:t>
+        <w:t>•   The format of a TIME is 'HH:</w:t>
+      </w:r>
+      <w:proofErr w:type="gramStart"/>
+      <w:r>
+        <w:t>MI:SS</w:t>
+      </w:r>
+      <w:proofErr w:type="gramEnd"/>
+      <w:r>
+        <w:t>'.</w:t>
       </w:r>
     </w:p>
     <w:p>
@@ -4708,6 +5213,7 @@
       <w:r>
         <w:t xml:space="preserve">  CREATE TABLE </w:t>
       </w:r>
+      <w:proofErr w:type="spellStart"/>
       <w:r>
         <w:rPr>
           <w:b/>
@@ -4715,6 +5221,7 @@
         </w:rPr>
         <w:t>table_name</w:t>
       </w:r>
+      <w:proofErr w:type="spellEnd"/>
       <w:r>
         <w:t xml:space="preserve"> (</w:t>
       </w:r>
@@ -4723,6 +5230,7 @@
       <w:r>
         <w:t>      </w:t>
       </w:r>
+      <w:proofErr w:type="spellStart"/>
       <w:r>
         <w:rPr>
           <w:b/>
@@ -4730,6 +5238,7 @@
         </w:rPr>
         <w:t>column_name</w:t>
       </w:r>
+      <w:proofErr w:type="spellEnd"/>
       <w:r>
         <w:t xml:space="preserve"> TIME</w:t>
       </w:r>
@@ -4782,6 +5291,7 @@
       <w:r>
         <w:t xml:space="preserve">  INSERT INTO </w:t>
       </w:r>
+      <w:proofErr w:type="spellStart"/>
       <w:r>
         <w:rPr>
           <w:b/>
@@ -4789,9 +5299,11 @@
         </w:rPr>
         <w:t>table_name</w:t>
       </w:r>
+      <w:proofErr w:type="spellEnd"/>
       <w:r>
         <w:t xml:space="preserve"> (</w:t>
       </w:r>
+      <w:proofErr w:type="spellStart"/>
       <w:r>
         <w:rPr>
           <w:b/>
@@ -4799,6 +5311,7 @@
         </w:rPr>
         <w:t>column_name</w:t>
       </w:r>
+      <w:proofErr w:type="spellEnd"/>
       <w:r>
         <w:t>) values ('17:34:20');</w:t>
       </w:r>
@@ -4830,17 +5343,41 @@
     </w:p>
     <w:p>
       <w:r>
-        <w:t>◦    CURTIME()</w:t>
-      </w:r>
-    </w:p>
-    <w:p>
-      <w:r>
-        <w:t>◦    ADDTIME()</w:t>
-      </w:r>
-    </w:p>
-    <w:p>
-      <w:r>
-        <w:t>◦    SUBTIME()</w:t>
+        <w:t xml:space="preserve">◦    </w:t>
+      </w:r>
+      <w:proofErr w:type="gramStart"/>
+      <w:r>
+        <w:t>CURTIME(</w:t>
+      </w:r>
+      <w:proofErr w:type="gramEnd"/>
+      <w:r>
+        <w:t>)</w:t>
+      </w:r>
+    </w:p>
+    <w:p>
+      <w:r>
+        <w:t xml:space="preserve">◦    </w:t>
+      </w:r>
+      <w:proofErr w:type="gramStart"/>
+      <w:r>
+        <w:t>ADDTIME(</w:t>
+      </w:r>
+      <w:proofErr w:type="gramEnd"/>
+      <w:r>
+        <w:t>)</w:t>
+      </w:r>
+    </w:p>
+    <w:p>
+      <w:r>
+        <w:t xml:space="preserve">◦    </w:t>
+      </w:r>
+      <w:proofErr w:type="gramStart"/>
+      <w:r>
+        <w:t>SUBTIME(</w:t>
+      </w:r>
+      <w:proofErr w:type="gramEnd"/>
+      <w:r>
+        <w:t>)</w:t>
       </w:r>
     </w:p>
     <w:p>
@@ -4850,12 +5387,21 @@
           <w:bCs/>
         </w:rPr>
       </w:pPr>
-      <w:r>
-        <w:rPr>
-          <w:b/>
-          <w:bCs/>
-        </w:rPr>
-        <w:t>CURTIME()</w:t>
+      <w:proofErr w:type="gramStart"/>
+      <w:r>
+        <w:rPr>
+          <w:b/>
+          <w:bCs/>
+        </w:rPr>
+        <w:t>CURTIME(</w:t>
+      </w:r>
+      <w:proofErr w:type="gramEnd"/>
+      <w:r>
+        <w:rPr>
+          <w:b/>
+          <w:bCs/>
+        </w:rPr>
+        <w:t>)</w:t>
       </w:r>
     </w:p>
     <w:p>
@@ -4872,6 +5418,7 @@
       <w:r>
         <w:t xml:space="preserve">  SELECT </w:t>
       </w:r>
+      <w:proofErr w:type="gramStart"/>
       <w:r>
         <w:rPr>
           <w:b/>
@@ -4880,7 +5427,11 @@
         <w:t>CURTIME</w:t>
       </w:r>
       <w:r>
-        <w:t>();</w:t>
+        <w:t>(</w:t>
+      </w:r>
+      <w:proofErr w:type="gramEnd"/>
+      <w:r>
+        <w:t>);</w:t>
       </w:r>
     </w:p>
     <w:p>
@@ -4895,12 +5446,37 @@
           <w:bCs/>
         </w:rPr>
       </w:pPr>
-      <w:r>
-        <w:rPr>
-          <w:b/>
-          <w:bCs/>
-        </w:rPr>
-        <w:t>ADDTIME() &amp; SUBTIME()</w:t>
+      <w:proofErr w:type="gramStart"/>
+      <w:r>
+        <w:rPr>
+          <w:b/>
+          <w:bCs/>
+        </w:rPr>
+        <w:t>ADDTIME(</w:t>
+      </w:r>
+      <w:proofErr w:type="gramEnd"/>
+      <w:r>
+        <w:rPr>
+          <w:b/>
+          <w:bCs/>
+        </w:rPr>
+        <w:t xml:space="preserve">) &amp; </w:t>
+      </w:r>
+      <w:proofErr w:type="gramStart"/>
+      <w:r>
+        <w:rPr>
+          <w:b/>
+          <w:bCs/>
+        </w:rPr>
+        <w:t>SUBTIME(</w:t>
+      </w:r>
+      <w:proofErr w:type="gramEnd"/>
+      <w:r>
+        <w:rPr>
+          <w:b/>
+          <w:bCs/>
+        </w:rPr>
+        <w:t>)</w:t>
       </w:r>
     </w:p>
     <w:p>
@@ -4917,6 +5493,7 @@
       <w:r>
         <w:t xml:space="preserve">  SELECT </w:t>
       </w:r>
+      <w:proofErr w:type="gramStart"/>
       <w:r>
         <w:rPr>
           <w:b/>
@@ -4925,13 +5502,18 @@
         <w:t>ADDTIME</w:t>
       </w:r>
       <w:r>
-        <w:t>('11:30:45', '15:30:45')</w:t>
+        <w:t>(</w:t>
+      </w:r>
+      <w:proofErr w:type="gramEnd"/>
+      <w:r>
+        <w:t>'11:30:45', '15:30:45')</w:t>
       </w:r>
     </w:p>
     <w:p>
       <w:r>
         <w:t xml:space="preserve">  SELECT </w:t>
       </w:r>
+      <w:proofErr w:type="gramStart"/>
       <w:r>
         <w:rPr>
           <w:b/>
@@ -4940,7 +5522,11 @@
         <w:t>SUBTIME</w:t>
       </w:r>
       <w:r>
-        <w:t>('11:30:45', '15:30:45')</w:t>
+        <w:t>(</w:t>
+      </w:r>
+      <w:proofErr w:type="gramEnd"/>
+      <w:r>
+        <w:t>'11:30:45', '15:30:45')</w:t>
       </w:r>
     </w:p>
     <w:p>
@@ -4975,7 +5561,15 @@
     </w:p>
     <w:p>
       <w:r>
-        <w:t>•   The format is as follows: 'YYYY-MM-DD HH:MI:SS'</w:t>
+        <w:t>•   The format is as follows: 'YYYY-MM-DD HH:</w:t>
+      </w:r>
+      <w:proofErr w:type="gramStart"/>
+      <w:r>
+        <w:t>MI:SS</w:t>
+      </w:r>
+      <w:proofErr w:type="gramEnd"/>
+      <w:r>
+        <w:t>'</w:t>
       </w:r>
     </w:p>
     <w:p>
@@ -5008,6 +5602,7 @@
         <w:lastRenderedPageBreak/>
         <w:t xml:space="preserve">  CREATE TABLE </w:t>
       </w:r>
+      <w:proofErr w:type="spellStart"/>
       <w:r>
         <w:rPr>
           <w:b/>
@@ -5015,6 +5610,7 @@
         </w:rPr>
         <w:t>table_name</w:t>
       </w:r>
+      <w:proofErr w:type="spellEnd"/>
       <w:r>
         <w:t xml:space="preserve"> (</w:t>
       </w:r>
@@ -5046,7 +5642,15 @@
         <w:t>column2</w:t>
       </w:r>
       <w:r>
-        <w:t xml:space="preserve"> VARCHAR(100),</w:t>
+        <w:t xml:space="preserve"> </w:t>
+      </w:r>
+      <w:proofErr w:type="gramStart"/>
+      <w:r>
+        <w:t>VARCHAR(</w:t>
+      </w:r>
+      <w:proofErr w:type="gramEnd"/>
+      <w:r>
+        <w:t>100),</w:t>
       </w:r>
     </w:p>
     <w:p>
@@ -5078,6 +5682,7 @@
       <w:r>
         <w:t xml:space="preserve">  CREATE TABLE </w:t>
       </w:r>
+      <w:proofErr w:type="spellStart"/>
       <w:r>
         <w:rPr>
           <w:b/>
@@ -5085,6 +5690,7 @@
         </w:rPr>
         <w:t>table_name</w:t>
       </w:r>
+      <w:proofErr w:type="spellEnd"/>
       <w:r>
         <w:t xml:space="preserve"> (</w:t>
       </w:r>
@@ -5116,7 +5722,15 @@
         <w:t>column2</w:t>
       </w:r>
       <w:r>
-        <w:t xml:space="preserve"> VARCHAR(100),</w:t>
+        <w:t xml:space="preserve"> </w:t>
+      </w:r>
+      <w:proofErr w:type="gramStart"/>
+      <w:r>
+        <w:t>VARCHAR(</w:t>
+      </w:r>
+      <w:proofErr w:type="gramEnd"/>
+      <w:r>
+        <w:t>100),</w:t>
       </w:r>
     </w:p>
     <w:p>
@@ -5163,6 +5777,7 @@
       <w:r>
         <w:t xml:space="preserve">  CREATE TABLE </w:t>
       </w:r>
+      <w:proofErr w:type="spellStart"/>
       <w:r>
         <w:rPr>
           <w:b/>
@@ -5170,6 +5785,7 @@
         </w:rPr>
         <w:t>table_name</w:t>
       </w:r>
+      <w:proofErr w:type="spellEnd"/>
       <w:r>
         <w:t xml:space="preserve"> (</w:t>
       </w:r>
@@ -5201,7 +5817,15 @@
         <w:t>column2</w:t>
       </w:r>
       <w:r>
-        <w:t xml:space="preserve"> VARCHAR(100),</w:t>
+        <w:t xml:space="preserve"> </w:t>
+      </w:r>
+      <w:proofErr w:type="gramStart"/>
+      <w:r>
+        <w:t>VARCHAR(</w:t>
+      </w:r>
+      <w:proofErr w:type="gramEnd"/>
+      <w:r>
+        <w:t>100),</w:t>
       </w:r>
     </w:p>
     <w:p>
@@ -5221,8 +5845,13 @@
     </w:p>
     <w:p/>
     <w:p>
-      <w:r>
-        <w:t>mysql&gt; show databases;</w:t>
+      <w:proofErr w:type="spellStart"/>
+      <w:r>
+        <w:t>mysql</w:t>
+      </w:r>
+      <w:proofErr w:type="spellEnd"/>
+      <w:r>
+        <w:t>&gt; show databases;</w:t>
       </w:r>
     </w:p>
     <w:p>
@@ -5242,22 +5871,54 @@
     </w:p>
     <w:p>
       <w:r>
-        <w:t>| information_schema     |</w:t>
-      </w:r>
-    </w:p>
-    <w:p>
-      <w:r>
-        <w:t>| jeevan_raksha_pharmacy |</w:t>
-      </w:r>
-    </w:p>
-    <w:p>
-      <w:r>
-        <w:t>| mysql                  |</w:t>
-      </w:r>
-    </w:p>
-    <w:p>
-      <w:r>
-        <w:t>| performance_schema     |</w:t>
+        <w:t xml:space="preserve">| </w:t>
+      </w:r>
+      <w:proofErr w:type="spellStart"/>
+      <w:r>
+        <w:t>information_schema</w:t>
+      </w:r>
+      <w:proofErr w:type="spellEnd"/>
+      <w:r>
+        <w:t xml:space="preserve">     |</w:t>
+      </w:r>
+    </w:p>
+    <w:p>
+      <w:r>
+        <w:t xml:space="preserve">| </w:t>
+      </w:r>
+      <w:proofErr w:type="spellStart"/>
+      <w:r>
+        <w:t>jeevan_raksha_pharmacy</w:t>
+      </w:r>
+      <w:proofErr w:type="spellEnd"/>
+      <w:r>
+        <w:t xml:space="preserve"> |</w:t>
+      </w:r>
+    </w:p>
+    <w:p>
+      <w:r>
+        <w:t xml:space="preserve">| </w:t>
+      </w:r>
+      <w:proofErr w:type="spellStart"/>
+      <w:r>
+        <w:t>mysql</w:t>
+      </w:r>
+      <w:proofErr w:type="spellEnd"/>
+      <w:r>
+        <w:t>                  |</w:t>
+      </w:r>
+    </w:p>
+    <w:p>
+      <w:r>
+        <w:t xml:space="preserve">| </w:t>
+      </w:r>
+      <w:proofErr w:type="spellStart"/>
+      <w:r>
+        <w:t>performance_schema</w:t>
+      </w:r>
+      <w:proofErr w:type="spellEnd"/>
+      <w:r>
+        <w:t xml:space="preserve">     |</w:t>
       </w:r>
     </w:p>
     <w:p>
@@ -5278,8 +5939,13 @@
     </w:p>
     <w:p/>
     <w:p>
-      <w:r>
-        <w:t>mysql&gt; CREATE DATABASE PFS7;</w:t>
+      <w:proofErr w:type="spellStart"/>
+      <w:r>
+        <w:t>mysql</w:t>
+      </w:r>
+      <w:proofErr w:type="spellEnd"/>
+      <w:r>
+        <w:t>&gt; CREATE DATABASE PFS7;</w:t>
       </w:r>
     </w:p>
     <w:p>
@@ -5289,8 +5955,13 @@
     </w:p>
     <w:p/>
     <w:p>
-      <w:r>
-        <w:t>mysql&gt; SHOW DATABASES;</w:t>
+      <w:proofErr w:type="spellStart"/>
+      <w:r>
+        <w:t>mysql</w:t>
+      </w:r>
+      <w:proofErr w:type="spellEnd"/>
+      <w:r>
+        <w:t>&gt; SHOW DATABASES;</w:t>
       </w:r>
     </w:p>
     <w:p>
@@ -5310,22 +5981,54 @@
     </w:p>
     <w:p>
       <w:r>
-        <w:t>| information_schema     |</w:t>
-      </w:r>
-    </w:p>
-    <w:p>
-      <w:r>
-        <w:t>| jeevan_raksha_pharmacy |</w:t>
-      </w:r>
-    </w:p>
-    <w:p>
-      <w:r>
-        <w:t>| mysql                  |</w:t>
-      </w:r>
-    </w:p>
-    <w:p>
-      <w:r>
-        <w:t>| performance_schema     |</w:t>
+        <w:t xml:space="preserve">| </w:t>
+      </w:r>
+      <w:proofErr w:type="spellStart"/>
+      <w:r>
+        <w:t>information_schema</w:t>
+      </w:r>
+      <w:proofErr w:type="spellEnd"/>
+      <w:r>
+        <w:t xml:space="preserve">     |</w:t>
+      </w:r>
+    </w:p>
+    <w:p>
+      <w:r>
+        <w:t xml:space="preserve">| </w:t>
+      </w:r>
+      <w:proofErr w:type="spellStart"/>
+      <w:r>
+        <w:t>jeevan_raksha_pharmacy</w:t>
+      </w:r>
+      <w:proofErr w:type="spellEnd"/>
+      <w:r>
+        <w:t xml:space="preserve"> |</w:t>
+      </w:r>
+    </w:p>
+    <w:p>
+      <w:r>
+        <w:t xml:space="preserve">| </w:t>
+      </w:r>
+      <w:proofErr w:type="spellStart"/>
+      <w:r>
+        <w:t>mysql</w:t>
+      </w:r>
+      <w:proofErr w:type="spellEnd"/>
+      <w:r>
+        <w:t>                  |</w:t>
+      </w:r>
+    </w:p>
+    <w:p>
+      <w:r>
+        <w:t xml:space="preserve">| </w:t>
+      </w:r>
+      <w:proofErr w:type="spellStart"/>
+      <w:r>
+        <w:t>performance_schema</w:t>
+      </w:r>
+      <w:proofErr w:type="spellEnd"/>
+      <w:r>
+        <w:t xml:space="preserve">     |</w:t>
       </w:r>
     </w:p>
     <w:p>
@@ -5350,8 +6053,13 @@
     </w:p>
     <w:p/>
     <w:p>
-      <w:r>
-        <w:t>mysql&gt; USE PFS7;</w:t>
+      <w:proofErr w:type="spellStart"/>
+      <w:r>
+        <w:t>mysql</w:t>
+      </w:r>
+      <w:proofErr w:type="spellEnd"/>
+      <w:r>
+        <w:t>&gt; USE PFS7;</w:t>
       </w:r>
     </w:p>
     <w:p>
@@ -5360,23 +6068,57 @@
       </w:r>
     </w:p>
     <w:p>
-      <w:r>
-        <w:t>mysql&gt; CREATE TABLE EMPLOYEES(</w:t>
-      </w:r>
-    </w:p>
-    <w:p>
-      <w:r>
-        <w:t>    -&gt; EMPID CHAR(5),</w:t>
-      </w:r>
-    </w:p>
-    <w:p>
-      <w:r>
-        <w:t>    -&gt; FNAME VARCHAR(100),</w:t>
-      </w:r>
-    </w:p>
-    <w:p>
-      <w:r>
-        <w:t>    -&gt; LNAME VARCHAR(30),</w:t>
+      <w:proofErr w:type="spellStart"/>
+      <w:r>
+        <w:t>mysql</w:t>
+      </w:r>
+      <w:proofErr w:type="spellEnd"/>
+      <w:r>
+        <w:t xml:space="preserve">&gt; CREATE TABLE </w:t>
+      </w:r>
+      <w:proofErr w:type="gramStart"/>
+      <w:r>
+        <w:t>EMPLOYEES(</w:t>
+      </w:r>
+      <w:proofErr w:type="gramEnd"/>
+    </w:p>
+    <w:p>
+      <w:r>
+        <w:t xml:space="preserve">    -&gt; EMPID </w:t>
+      </w:r>
+      <w:proofErr w:type="gramStart"/>
+      <w:r>
+        <w:t>CHAR(</w:t>
+      </w:r>
+      <w:proofErr w:type="gramEnd"/>
+      <w:r>
+        <w:t>5),</w:t>
+      </w:r>
+    </w:p>
+    <w:p>
+      <w:r>
+        <w:t xml:space="preserve">    -&gt; FNAME </w:t>
+      </w:r>
+      <w:proofErr w:type="gramStart"/>
+      <w:r>
+        <w:t>VARCHAR(</w:t>
+      </w:r>
+      <w:proofErr w:type="gramEnd"/>
+      <w:r>
+        <w:t>100),</w:t>
+      </w:r>
+    </w:p>
+    <w:p>
+      <w:r>
+        <w:t xml:space="preserve">    -&gt; LNAME </w:t>
+      </w:r>
+      <w:proofErr w:type="gramStart"/>
+      <w:r>
+        <w:t>VARCHAR(</w:t>
+      </w:r>
+      <w:proofErr w:type="gramEnd"/>
+      <w:r>
+        <w:t>30),</w:t>
       </w:r>
     </w:p>
     <w:p>
@@ -5396,7 +6138,15 @@
     </w:p>
     <w:p>
       <w:r>
-        <w:t>    -&gt; DEPT VARCHAR(20)</w:t>
+        <w:t xml:space="preserve">    -&gt; DEPT </w:t>
+      </w:r>
+      <w:proofErr w:type="gramStart"/>
+      <w:r>
+        <w:t>VARCHAR(</w:t>
+      </w:r>
+      <w:proofErr w:type="gramEnd"/>
+      <w:r>
+        <w:t>20)</w:t>
       </w:r>
     </w:p>
     <w:p>
@@ -6021,6 +6771,7 @@
   <w:style w:type="character" w:default="1" w:styleId="DefaultParagraphFont">
     <w:name w:val="Default Paragraph Font"/>
     <w:uiPriority w:val="1"/>
+    <w:semiHidden/>
     <w:unhideWhenUsed/>
   </w:style>
   <w:style w:type="table" w:default="1" w:styleId="TableNormal">

</xml_diff>